<commit_message>
feat: Introduce new modules for equipment calibration, quality management, audits, competencies, and lot tracking.
</commit_message>
<xml_diff>
--- a/addons/amunet_quality/quality documents/cc/CC hojas maestras.docx
+++ b/addons/amunet_quality/quality documents/cc/CC hojas maestras.docx
@@ -1,6 +1,6 @@
 
 <file path=word/document.xml><?xml version="1.0" encoding="utf-8"?>
-<w:document xmlns:wpc="http://schemas.microsoft.com/office/word/2010/wordprocessingCanvas" xmlns:cx="http://schemas.microsoft.com/office/drawing/2014/chartex" xmlns:cx1="http://schemas.microsoft.com/office/drawing/2015/9/8/chartex" xmlns:cx2="http://schemas.microsoft.com/office/drawing/2015/10/21/chartex" xmlns:cx3="http://schemas.microsoft.com/office/drawing/2016/5/9/chartex" xmlns:cx4="http://schemas.microsoft.com/office/drawing/2016/5/10/chartex" xmlns:cx5="http://schemas.microsoft.com/office/drawing/2016/5/11/chartex" xmlns:cx6="http://schemas.microsoft.com/office/drawing/2016/5/12/chartex" xmlns:cx7="http://schemas.microsoft.com/office/drawing/2016/5/13/chartex" xmlns:cx8="http://schemas.microsoft.com/office/drawing/2016/5/14/chartex" xmlns:mc="http://schemas.openxmlformats.org/markup-compatibility/2006" xmlns:aink="http://schemas.microsoft.com/office/drawing/2016/ink" xmlns:am3d="http://schemas.microsoft.com/office/drawing/2017/model3d" xmlns:o="urn:schemas-microsoft-com:office:office" xmlns:oel="http://schemas.microsoft.com/office/2019/extlst" xmlns:r="http://schemas.openxmlformats.org/officeDocument/2006/relationships" xmlns:m="http://schemas.openxmlformats.org/officeDocument/2006/math" xmlns:v="urn:schemas-microsoft-com:vml" xmlns:wp14="http://schemas.microsoft.com/office/word/2010/wordprocessingDrawing" xmlns:wp="http://schemas.openxmlformats.org/drawingml/2006/wordprocessingDrawing" xmlns:w10="urn:schemas-microsoft-com:office:word" xmlns:w="http://schemas.openxmlformats.org/wordprocessingml/2006/main" xmlns:w14="http://schemas.microsoft.com/office/word/2010/wordml" xmlns:w15="http://schemas.microsoft.com/office/word/2012/wordml" xmlns:w16cex="http://schemas.microsoft.com/office/word/2018/wordml/cex" xmlns:w16cid="http://schemas.microsoft.com/office/word/2016/wordml/cid" xmlns:w16="http://schemas.microsoft.com/office/word/2018/wordml" xmlns:w16du="http://schemas.microsoft.com/office/word/2023/wordml/word16du" xmlns:w16sdtdh="http://schemas.microsoft.com/office/word/2020/wordml/sdtdatahash" xmlns:w16sdtfl="http://schemas.microsoft.com/office/word/2024/wordml/sdtformatlock" xmlns:w16se="http://schemas.microsoft.com/office/word/2015/wordml/symex" xmlns:wpg="http://schemas.microsoft.com/office/word/2010/wordprocessingGroup" xmlns:wpi="http://schemas.microsoft.com/office/word/2010/wordprocessingInk" xmlns:wne="http://schemas.microsoft.com/office/word/2006/wordml" xmlns:wps="http://schemas.microsoft.com/office/word/2010/wordprocessingShape" mc:Ignorable="w14 w15 w16se w16cid w16 w16cex w16sdtdh w16sdtfl w16du wp14">
+<w:document xmlns:wpc="http://schemas.microsoft.com/office/word/2010/wordprocessingCanvas" xmlns:cx="http://schemas.microsoft.com/office/drawing/2014/chartex" xmlns:cx1="http://schemas.microsoft.com/office/drawing/2015/9/8/chartex" xmlns:cx2="http://schemas.microsoft.com/office/drawing/2015/10/21/chartex" xmlns:cx3="http://schemas.microsoft.com/office/drawing/2016/5/9/chartex" xmlns:cx4="http://schemas.microsoft.com/office/drawing/2016/5/10/chartex" xmlns:cx5="http://schemas.microsoft.com/office/drawing/2016/5/11/chartex" xmlns:cx6="http://schemas.microsoft.com/office/drawing/2016/5/12/chartex" xmlns:cx7="http://schemas.microsoft.com/office/drawing/2016/5/13/chartex" xmlns:cx8="http://schemas.microsoft.com/office/drawing/2016/5/14/chartex" xmlns:mc="http://schemas.openxmlformats.org/markup-compatibility/2006" xmlns:aink="http://schemas.microsoft.com/office/drawing/2016/ink" xmlns:am3d="http://schemas.microsoft.com/office/drawing/2017/model3d" xmlns:o="urn:schemas-microsoft-com:office:office" xmlns:r="http://schemas.openxmlformats.org/officeDocument/2006/relationships" xmlns:m="http://schemas.openxmlformats.org/officeDocument/2006/math" xmlns:v="urn:schemas-microsoft-com:vml" xmlns:wp14="http://schemas.microsoft.com/office/word/2010/wordprocessingDrawing" xmlns:wp="http://schemas.openxmlformats.org/drawingml/2006/wordprocessingDrawing" xmlns:w10="urn:schemas-microsoft-com:office:word" xmlns:w="http://schemas.openxmlformats.org/wordprocessingml/2006/main" xmlns:w14="http://schemas.microsoft.com/office/word/2010/wordml" xmlns:w15="http://schemas.microsoft.com/office/word/2012/wordml" xmlns:w16cex="http://schemas.microsoft.com/office/word/2018/wordml/cex" xmlns:w16cid="http://schemas.microsoft.com/office/word/2016/wordml/cid" xmlns:w16="http://schemas.microsoft.com/office/word/2018/wordml" xmlns:w16sdtdh="http://schemas.microsoft.com/office/word/2020/wordml/sdtdatahash" xmlns:w16se="http://schemas.microsoft.com/office/word/2015/wordml/symex" xmlns:wpg="http://schemas.microsoft.com/office/word/2010/wordprocessingGroup" xmlns:wpi="http://schemas.microsoft.com/office/word/2010/wordprocessingInk" xmlns:wne="http://schemas.microsoft.com/office/word/2006/wordml" xmlns:wps="http://schemas.microsoft.com/office/word/2010/wordprocessingShape" mc:Ignorable="w14 w15 w16se w16cid w16 w16cex w16sdtdh wp14">
   <w:body>
     <w:p>
       <w:pPr>
@@ -12165,7 +12165,15 @@
                 <w:sz w:val="12"/>
                 <w:szCs w:val="12"/>
               </w:rPr>
-              <w:t>MAVI-15</w:t>
+              <w:t>MAVI-1</w:t>
+            </w:r>
+            <w:r>
+              <w:rPr>
+                <w:rFonts w:ascii="Arial" w:hAnsi="Arial" w:cs="Arial"/>
+                <w:sz w:val="12"/>
+                <w:szCs w:val="12"/>
+              </w:rPr>
+              <w:t>6</w:t>
             </w:r>
           </w:p>
         </w:tc>
@@ -14724,7 +14732,15 @@
                 <w:sz w:val="12"/>
                 <w:szCs w:val="12"/>
               </w:rPr>
-              <w:t>MAVI-16</w:t>
+              <w:t>MAVI-1</w:t>
+            </w:r>
+            <w:r>
+              <w:rPr>
+                <w:rFonts w:ascii="Arial" w:hAnsi="Arial" w:cs="Arial"/>
+                <w:sz w:val="12"/>
+                <w:szCs w:val="12"/>
+              </w:rPr>
+              <w:t>5</w:t>
             </w:r>
           </w:p>
         </w:tc>
@@ -15008,61 +15024,58 @@
                 <w:szCs w:val="12"/>
                 <w:lang w:val="es-ES"/>
               </w:rPr>
-              <w:t xml:space="preserve">Verificación de </w:t>
-            </w:r>
-            <w:r>
-              <w:rPr>
-                <w:rFonts w:ascii="Arial" w:hAnsi="Arial" w:cs="Arial"/>
-                <w:b/>
-                <w:bCs/>
+              <w:t>Verificación de concentración</w:t>
+            </w:r>
+          </w:p>
+          <w:p>
+            <w:pPr>
+              <w:rPr>
+                <w:rFonts w:ascii="Arial" w:hAnsi="Arial" w:cs="Arial"/>
                 <w:sz w:val="12"/>
                 <w:szCs w:val="12"/>
                 <w:lang w:val="es-ES"/>
               </w:rPr>
-              <w:t>c</w:t>
-            </w:r>
-            <w:r>
-              <w:rPr>
-                <w:rFonts w:ascii="Arial" w:hAnsi="Arial" w:cs="Arial"/>
-                <w:b/>
-                <w:bCs/>
+            </w:pPr>
+          </w:p>
+          <w:p>
+            <w:pPr>
+              <w:rPr>
+                <w:rFonts w:ascii="Arial" w:hAnsi="Arial" w:cs="Arial"/>
                 <w:sz w:val="12"/>
                 <w:szCs w:val="12"/>
                 <w:lang w:val="es-ES"/>
               </w:rPr>
-              <w:t>oncentración</w:t>
-            </w:r>
-          </w:p>
-          <w:p>
-            <w:pPr>
-              <w:rPr>
-                <w:rFonts w:ascii="Arial" w:hAnsi="Arial" w:cs="Arial"/>
+            </w:pPr>
+            <w:r>
+              <w:rPr>
+                <w:rFonts w:ascii="Arial" w:hAnsi="Arial" w:cs="Arial"/>
+                <w:b/>
+                <w:bCs/>
                 <w:sz w:val="12"/>
                 <w:szCs w:val="12"/>
                 <w:lang w:val="es-ES"/>
               </w:rPr>
-            </w:pPr>
-          </w:p>
-          <w:p>
-            <w:pPr>
+              <w:t>Paso 1:</w:t>
+            </w:r>
+            <w:r>
               <w:rPr>
                 <w:rFonts w:ascii="Arial" w:hAnsi="Arial" w:cs="Arial"/>
                 <w:sz w:val="12"/>
                 <w:szCs w:val="12"/>
                 <w:lang w:val="es-ES"/>
               </w:rPr>
-            </w:pPr>
-            <w:r>
-              <w:rPr>
-                <w:rFonts w:ascii="Arial" w:hAnsi="Arial" w:cs="Arial"/>
-                <w:b/>
-                <w:bCs/>
+              <w:t xml:space="preserve"> Seleccione la concentración objetivo. </w:t>
+            </w:r>
+          </w:p>
+          <w:p>
+            <w:pPr>
+              <w:rPr>
+                <w:rFonts w:ascii="Arial" w:hAnsi="Arial" w:cs="Arial"/>
                 <w:sz w:val="12"/>
                 <w:szCs w:val="12"/>
                 <w:lang w:val="es-ES"/>
               </w:rPr>
-              <w:t>Paso 1:</w:t>
-            </w:r>
+            </w:pPr>
             <w:r>
               <w:rPr>
                 <w:rFonts w:ascii="Arial" w:hAnsi="Arial" w:cs="Arial"/>
@@ -15070,16 +15083,16 @@
                 <w:szCs w:val="12"/>
                 <w:lang w:val="es-ES"/>
               </w:rPr>
-              <w:t xml:space="preserve"> Seleccione la </w:t>
-            </w:r>
-            <w:r>
-              <w:rPr>
-                <w:rFonts w:ascii="Arial" w:hAnsi="Arial" w:cs="Arial"/>
+              <w:t>(</w:t>
+            </w:r>
+            <w:r>
+              <w:rPr>
+                <w:rFonts w:ascii="Segoe UI Emoji" w:hAnsi="Segoe UI Emoji" w:cs="Segoe UI Emoji"/>
                 <w:sz w:val="12"/>
                 <w:szCs w:val="12"/>
                 <w:lang w:val="es-ES"/>
               </w:rPr>
-              <w:t>c</w:t>
+              <w:t>⚪</w:t>
             </w:r>
             <w:r>
               <w:rPr>
@@ -15088,7 +15101,7 @@
                 <w:szCs w:val="12"/>
                 <w:lang w:val="es-ES"/>
               </w:rPr>
-              <w:t xml:space="preserve">oncentración </w:t>
+              <w:t xml:space="preserve">) Baja (Se espera: </w:t>
             </w:r>
             <w:r>
               <w:rPr>
@@ -15097,7 +15110,7 @@
                 <w:szCs w:val="12"/>
                 <w:lang w:val="es-ES"/>
               </w:rPr>
-              <w:t>o</w:t>
+              <w:t xml:space="preserve">T ≠ R </w:t>
             </w:r>
             <w:r>
               <w:rPr>
@@ -15106,25 +15119,34 @@
                 <w:szCs w:val="12"/>
                 <w:lang w:val="es-ES"/>
               </w:rPr>
-              <w:t xml:space="preserve">bjetivo. </w:t>
-            </w:r>
-          </w:p>
-          <w:p>
-            <w:pPr>
+              <w:t xml:space="preserve">o </w:t>
+            </w:r>
+            <w:r>
               <w:rPr>
                 <w:rFonts w:ascii="Arial" w:hAnsi="Arial" w:cs="Arial"/>
                 <w:sz w:val="12"/>
                 <w:szCs w:val="12"/>
                 <w:lang w:val="es-ES"/>
               </w:rPr>
-            </w:pPr>
-            <w:r>
+              <w:t>T &lt; R)</w:t>
+            </w:r>
+          </w:p>
+          <w:p>
+            <w:pPr>
               <w:rPr>
                 <w:rFonts w:ascii="Arial" w:hAnsi="Arial" w:cs="Arial"/>
                 <w:sz w:val="12"/>
                 <w:szCs w:val="12"/>
                 <w:lang w:val="es-ES"/>
               </w:rPr>
+            </w:pPr>
+            <w:r>
+              <w:rPr>
+                <w:rFonts w:ascii="Arial" w:hAnsi="Arial" w:cs="Arial"/>
+                <w:sz w:val="12"/>
+                <w:szCs w:val="12"/>
+                <w:lang w:val="es-ES"/>
+              </w:rPr>
               <w:t>(</w:t>
             </w:r>
             <w:r>
@@ -15143,17 +15165,18 @@
                 <w:szCs w:val="12"/>
                 <w:lang w:val="es-ES"/>
               </w:rPr>
-              <w:t xml:space="preserve">) Baja (Se espera: </w:t>
-            </w:r>
-            <w:r>
+              <w:t>) Intermedia (Se espera: T ~ R)</w:t>
+            </w:r>
+          </w:p>
+          <w:p>
+            <w:pPr>
               <w:rPr>
                 <w:rFonts w:ascii="Arial" w:hAnsi="Arial" w:cs="Arial"/>
                 <w:sz w:val="12"/>
                 <w:szCs w:val="12"/>
                 <w:lang w:val="es-ES"/>
               </w:rPr>
-              <w:t>T ≠ R</w:t>
-            </w:r>
+            </w:pPr>
             <w:r>
               <w:rPr>
                 <w:rFonts w:ascii="Arial" w:hAnsi="Arial" w:cs="Arial"/>
@@ -15161,16 +15184,16 @@
                 <w:szCs w:val="12"/>
                 <w:lang w:val="es-ES"/>
               </w:rPr>
-              <w:t xml:space="preserve"> </w:t>
-            </w:r>
-            <w:r>
-              <w:rPr>
-                <w:rFonts w:ascii="Arial" w:hAnsi="Arial" w:cs="Arial"/>
+              <w:t>(</w:t>
+            </w:r>
+            <w:r>
+              <w:rPr>
+                <w:rFonts w:ascii="Segoe UI Emoji" w:hAnsi="Segoe UI Emoji" w:cs="Segoe UI Emoji"/>
                 <w:sz w:val="12"/>
                 <w:szCs w:val="12"/>
                 <w:lang w:val="es-ES"/>
               </w:rPr>
-              <w:t xml:space="preserve">o </w:t>
+              <w:t>⚪</w:t>
             </w:r>
             <w:r>
               <w:rPr>
@@ -15179,7 +15202,7 @@
                 <w:szCs w:val="12"/>
                 <w:lang w:val="es-ES"/>
               </w:rPr>
-              <w:t>T &lt; R)</w:t>
+              <w:t>) Alta (Se espera: T &gt; R)</w:t>
             </w:r>
           </w:p>
           <w:p>
@@ -15191,111 +15214,26 @@
                 <w:lang w:val="es-ES"/>
               </w:rPr>
             </w:pPr>
-            <w:r>
+          </w:p>
+          <w:p>
+            <w:pPr>
               <w:rPr>
                 <w:rFonts w:ascii="Arial" w:hAnsi="Arial" w:cs="Arial"/>
                 <w:sz w:val="12"/>
                 <w:szCs w:val="12"/>
                 <w:lang w:val="es-ES"/>
               </w:rPr>
-              <w:t>(</w:t>
-            </w:r>
-            <w:r>
-              <w:rPr>
-                <w:rFonts w:ascii="Segoe UI Emoji" w:hAnsi="Segoe UI Emoji" w:cs="Segoe UI Emoji"/>
+            </w:pPr>
+            <w:r>
+              <w:rPr>
+                <w:rFonts w:ascii="Arial" w:hAnsi="Arial" w:cs="Arial"/>
+                <w:b/>
+                <w:bCs/>
                 <w:sz w:val="12"/>
                 <w:szCs w:val="12"/>
                 <w:lang w:val="es-ES"/>
               </w:rPr>
-              <w:t>⚪</w:t>
-            </w:r>
-            <w:r>
-              <w:rPr>
-                <w:rFonts w:ascii="Arial" w:hAnsi="Arial" w:cs="Arial"/>
-                <w:sz w:val="12"/>
-                <w:szCs w:val="12"/>
-                <w:lang w:val="es-ES"/>
-              </w:rPr>
-              <w:t>) Intermedia (Se espera: T ~ R)</w:t>
-            </w:r>
-          </w:p>
-          <w:p>
-            <w:pPr>
-              <w:rPr>
-                <w:rFonts w:ascii="Arial" w:hAnsi="Arial" w:cs="Arial"/>
-                <w:sz w:val="12"/>
-                <w:szCs w:val="12"/>
-                <w:lang w:val="es-ES"/>
-              </w:rPr>
-            </w:pPr>
-            <w:r>
-              <w:rPr>
-                <w:rFonts w:ascii="Arial" w:hAnsi="Arial" w:cs="Arial"/>
-                <w:sz w:val="12"/>
-                <w:szCs w:val="12"/>
-                <w:lang w:val="es-ES"/>
-              </w:rPr>
-              <w:t>(</w:t>
-            </w:r>
-            <w:r>
-              <w:rPr>
-                <w:rFonts w:ascii="Segoe UI Emoji" w:hAnsi="Segoe UI Emoji" w:cs="Segoe UI Emoji"/>
-                <w:sz w:val="12"/>
-                <w:szCs w:val="12"/>
-                <w:lang w:val="es-ES"/>
-              </w:rPr>
-              <w:t>⚪</w:t>
-            </w:r>
-            <w:r>
-              <w:rPr>
-                <w:rFonts w:ascii="Arial" w:hAnsi="Arial" w:cs="Arial"/>
-                <w:sz w:val="12"/>
-                <w:szCs w:val="12"/>
-                <w:lang w:val="es-ES"/>
-              </w:rPr>
-              <w:t>) Alta (Se espera: T &gt; R)</w:t>
-            </w:r>
-          </w:p>
-          <w:p>
-            <w:pPr>
-              <w:rPr>
-                <w:rFonts w:ascii="Arial" w:hAnsi="Arial" w:cs="Arial"/>
-                <w:sz w:val="12"/>
-                <w:szCs w:val="12"/>
-                <w:lang w:val="es-ES"/>
-              </w:rPr>
-            </w:pPr>
-          </w:p>
-          <w:p>
-            <w:pPr>
-              <w:rPr>
-                <w:rFonts w:ascii="Arial" w:hAnsi="Arial" w:cs="Arial"/>
-                <w:sz w:val="12"/>
-                <w:szCs w:val="12"/>
-                <w:lang w:val="es-ES"/>
-              </w:rPr>
-            </w:pPr>
-            <w:r>
-              <w:rPr>
-                <w:rFonts w:ascii="Arial" w:hAnsi="Arial" w:cs="Arial"/>
-                <w:b/>
-                <w:bCs/>
-                <w:sz w:val="12"/>
-                <w:szCs w:val="12"/>
-                <w:lang w:val="es-ES"/>
-              </w:rPr>
-              <w:t xml:space="preserve">Paso 2: Registre </w:t>
-            </w:r>
-            <w:r>
-              <w:rPr>
-                <w:rFonts w:ascii="Arial" w:hAnsi="Arial" w:cs="Arial"/>
-                <w:b/>
-                <w:bCs/>
-                <w:sz w:val="12"/>
-                <w:szCs w:val="12"/>
-                <w:lang w:val="es-ES"/>
-              </w:rPr>
-              <w:t>los hallazgos</w:t>
+              <w:t>Paso 2: Registre los hallazgos</w:t>
             </w:r>
           </w:p>
           <w:p>
@@ -15330,40 +15268,36 @@
                 <w:szCs w:val="12"/>
                 <w:lang w:val="es-ES"/>
               </w:rPr>
-              <w:t xml:space="preserve">2.1 ¿La </w:t>
-            </w:r>
-            <w:r>
-              <w:rPr>
-                <w:rFonts w:ascii="Arial" w:hAnsi="Arial" w:cs="Arial"/>
-                <w:b/>
-                <w:bCs/>
+              <w:t>2.1 ¿La línea de Control (C) es visible?</w:t>
+            </w:r>
+          </w:p>
+          <w:p>
+            <w:pPr>
+              <w:rPr>
+                <w:rFonts w:ascii="Arial" w:hAnsi="Arial" w:cs="Arial"/>
                 <w:sz w:val="12"/>
                 <w:szCs w:val="12"/>
                 <w:lang w:val="es-ES"/>
               </w:rPr>
-              <w:t>l</w:t>
-            </w:r>
-            <w:r>
-              <w:rPr>
-                <w:rFonts w:ascii="Arial" w:hAnsi="Arial" w:cs="Arial"/>
-                <w:b/>
-                <w:bCs/>
+            </w:pPr>
+            <w:r>
+              <w:rPr>
+                <w:rFonts w:ascii="Arial" w:hAnsi="Arial" w:cs="Arial"/>
                 <w:sz w:val="12"/>
                 <w:szCs w:val="12"/>
                 <w:lang w:val="es-ES"/>
               </w:rPr>
-              <w:t>ínea de Control (C) es visible?</w:t>
-            </w:r>
-          </w:p>
-          <w:p>
-            <w:pPr>
-              <w:rPr>
-                <w:rFonts w:ascii="Arial" w:hAnsi="Arial" w:cs="Arial"/>
+              <w:t>(</w:t>
+            </w:r>
+            <w:r>
+              <w:rPr>
+                <w:rFonts w:ascii="Segoe UI Emoji" w:hAnsi="Segoe UI Emoji" w:cs="Segoe UI Emoji"/>
                 <w:sz w:val="12"/>
                 <w:szCs w:val="12"/>
                 <w:lang w:val="es-ES"/>
               </w:rPr>
-            </w:pPr>
+              <w:t>✅</w:t>
+            </w:r>
             <w:r>
               <w:rPr>
                 <w:rFonts w:ascii="Arial" w:hAnsi="Arial" w:cs="Arial"/>
@@ -15371,6 +15305,25 @@
                 <w:szCs w:val="12"/>
                 <w:lang w:val="es-ES"/>
               </w:rPr>
+              <w:t>) Sí</w:t>
+            </w:r>
+          </w:p>
+          <w:p>
+            <w:pPr>
+              <w:rPr>
+                <w:rFonts w:ascii="Arial" w:hAnsi="Arial" w:cs="Arial"/>
+                <w:sz w:val="12"/>
+                <w:szCs w:val="12"/>
+                <w:lang w:val="es-ES"/>
+              </w:rPr>
+            </w:pPr>
+            <w:r>
+              <w:rPr>
+                <w:rFonts w:ascii="Arial" w:hAnsi="Arial" w:cs="Arial"/>
+                <w:sz w:val="12"/>
+                <w:szCs w:val="12"/>
+                <w:lang w:val="es-ES"/>
+              </w:rPr>
               <w:t>(</w:t>
             </w:r>
             <w:r>
@@ -15380,7 +15333,7 @@
                 <w:szCs w:val="12"/>
                 <w:lang w:val="es-ES"/>
               </w:rPr>
-              <w:t>✅</w:t>
+              <w:t>❌</w:t>
             </w:r>
             <w:r>
               <w:rPr>
@@ -15389,7 +15342,7 @@
                 <w:szCs w:val="12"/>
                 <w:lang w:val="es-ES"/>
               </w:rPr>
-              <w:t>) Sí</w:t>
+              <w:t>) No (Esto invalida la prueba inmediatamente).</w:t>
             </w:r>
           </w:p>
           <w:p>
@@ -15401,13 +15354,46 @@
                 <w:lang w:val="es-ES"/>
               </w:rPr>
             </w:pPr>
-            <w:r>
-              <w:rPr>
-                <w:rFonts w:ascii="Arial" w:hAnsi="Arial" w:cs="Arial"/>
+          </w:p>
+          <w:p>
+            <w:pPr>
+              <w:rPr>
+                <w:rFonts w:ascii="Arial" w:hAnsi="Arial" w:cs="Arial"/>
+                <w:b/>
+                <w:bCs/>
                 <w:sz w:val="12"/>
                 <w:szCs w:val="12"/>
                 <w:lang w:val="es-ES"/>
               </w:rPr>
+            </w:pPr>
+            <w:r>
+              <w:rPr>
+                <w:rFonts w:ascii="Arial" w:hAnsi="Arial" w:cs="Arial"/>
+                <w:b/>
+                <w:bCs/>
+                <w:sz w:val="12"/>
+                <w:szCs w:val="12"/>
+                <w:lang w:val="es-ES"/>
+              </w:rPr>
+              <w:t>2.2 Comparación visual (T vs R):</w:t>
+            </w:r>
+          </w:p>
+          <w:p>
+            <w:pPr>
+              <w:rPr>
+                <w:rFonts w:ascii="Arial" w:hAnsi="Arial" w:cs="Arial"/>
+                <w:sz w:val="12"/>
+                <w:szCs w:val="12"/>
+                <w:lang w:val="es-ES"/>
+              </w:rPr>
+            </w:pPr>
+            <w:r>
+              <w:rPr>
+                <w:rFonts w:ascii="Arial" w:hAnsi="Arial" w:cs="Arial"/>
+                <w:sz w:val="12"/>
+                <w:szCs w:val="12"/>
+                <w:lang w:val="es-ES"/>
+              </w:rPr>
               <w:t>(</w:t>
             </w:r>
             <w:r>
@@ -15417,7 +15403,7 @@
                 <w:szCs w:val="12"/>
                 <w:lang w:val="es-ES"/>
               </w:rPr>
-              <w:t>❌</w:t>
+              <w:t>⚪</w:t>
             </w:r>
             <w:r>
               <w:rPr>
@@ -15426,82 +15412,73 @@
                 <w:szCs w:val="12"/>
                 <w:lang w:val="es-ES"/>
               </w:rPr>
-              <w:t>) No (Esto invalida la prueba inmediatamente)</w:t>
-            </w:r>
-            <w:r>
+              <w:t>) T ≠ R (No hay línea T)</w:t>
+            </w:r>
+          </w:p>
+          <w:p>
+            <w:pPr>
               <w:rPr>
                 <w:rFonts w:ascii="Arial" w:hAnsi="Arial" w:cs="Arial"/>
                 <w:sz w:val="12"/>
                 <w:szCs w:val="12"/>
                 <w:lang w:val="es-ES"/>
               </w:rPr>
-              <w:t>.</w:t>
-            </w:r>
-          </w:p>
-          <w:p>
-            <w:pPr>
+            </w:pPr>
+            <w:r>
               <w:rPr>
                 <w:rFonts w:ascii="Arial" w:hAnsi="Arial" w:cs="Arial"/>
                 <w:sz w:val="12"/>
                 <w:szCs w:val="12"/>
                 <w:lang w:val="es-ES"/>
               </w:rPr>
-            </w:pPr>
-          </w:p>
-          <w:p>
-            <w:pPr>
-              <w:rPr>
-                <w:rFonts w:ascii="Arial" w:hAnsi="Arial" w:cs="Arial"/>
-                <w:b/>
-                <w:bCs/>
+              <w:t>(</w:t>
+            </w:r>
+            <w:r>
+              <w:rPr>
+                <w:rFonts w:ascii="Segoe UI Emoji" w:hAnsi="Segoe UI Emoji" w:cs="Segoe UI Emoji"/>
                 <w:sz w:val="12"/>
                 <w:szCs w:val="12"/>
                 <w:lang w:val="es-ES"/>
               </w:rPr>
-            </w:pPr>
-            <w:r>
-              <w:rPr>
-                <w:rFonts w:ascii="Arial" w:hAnsi="Arial" w:cs="Arial"/>
-                <w:b/>
-                <w:bCs/>
+              <w:t>⚪</w:t>
+            </w:r>
+            <w:r>
+              <w:rPr>
+                <w:rFonts w:ascii="Arial" w:hAnsi="Arial" w:cs="Arial"/>
                 <w:sz w:val="12"/>
                 <w:szCs w:val="12"/>
                 <w:lang w:val="es-ES"/>
               </w:rPr>
-              <w:t xml:space="preserve">2.2 Comparación </w:t>
-            </w:r>
-            <w:r>
-              <w:rPr>
-                <w:rFonts w:ascii="Arial" w:hAnsi="Arial" w:cs="Arial"/>
-                <w:b/>
-                <w:bCs/>
+              <w:t>) T &lt; R (Menor intensidad)</w:t>
+            </w:r>
+          </w:p>
+          <w:p>
+            <w:pPr>
+              <w:rPr>
+                <w:rFonts w:ascii="Arial" w:hAnsi="Arial" w:cs="Arial"/>
                 <w:sz w:val="12"/>
                 <w:szCs w:val="12"/>
                 <w:lang w:val="es-ES"/>
               </w:rPr>
-              <w:t>v</w:t>
-            </w:r>
-            <w:r>
-              <w:rPr>
-                <w:rFonts w:ascii="Arial" w:hAnsi="Arial" w:cs="Arial"/>
-                <w:b/>
-                <w:bCs/>
+            </w:pPr>
+            <w:r>
+              <w:rPr>
+                <w:rFonts w:ascii="Arial" w:hAnsi="Arial" w:cs="Arial"/>
                 <w:sz w:val="12"/>
                 <w:szCs w:val="12"/>
                 <w:lang w:val="es-ES"/>
               </w:rPr>
-              <w:t>isual (T vs R):</w:t>
-            </w:r>
-          </w:p>
-          <w:p>
-            <w:pPr>
-              <w:rPr>
-                <w:rFonts w:ascii="Arial" w:hAnsi="Arial" w:cs="Arial"/>
+              <w:t>(</w:t>
+            </w:r>
+            <w:r>
+              <w:rPr>
+                <w:rFonts w:ascii="Segoe UI Emoji" w:hAnsi="Segoe UI Emoji" w:cs="Segoe UI Emoji"/>
                 <w:sz w:val="12"/>
                 <w:szCs w:val="12"/>
                 <w:lang w:val="es-ES"/>
               </w:rPr>
-            </w:pPr>
+              <w:t>⚪</w:t>
+            </w:r>
             <w:r>
               <w:rPr>
                 <w:rFonts w:ascii="Arial" w:hAnsi="Arial" w:cs="Arial"/>
@@ -15509,6 +15486,43 @@
                 <w:szCs w:val="12"/>
                 <w:lang w:val="es-ES"/>
               </w:rPr>
+              <w:t>) T ~ R (Intensidad similar</w:t>
+            </w:r>
+            <w:r>
+              <w:rPr>
+                <w:rFonts w:ascii="Arial" w:hAnsi="Arial" w:cs="Arial"/>
+                <w:sz w:val="12"/>
+                <w:szCs w:val="12"/>
+                <w:lang w:val="es-ES"/>
+              </w:rPr>
+              <w:t xml:space="preserve"> o igual</w:t>
+            </w:r>
+            <w:r>
+              <w:rPr>
+                <w:rFonts w:ascii="Arial" w:hAnsi="Arial" w:cs="Arial"/>
+                <w:sz w:val="12"/>
+                <w:szCs w:val="12"/>
+                <w:lang w:val="es-ES"/>
+              </w:rPr>
+              <w:t>)</w:t>
+            </w:r>
+          </w:p>
+          <w:p>
+            <w:pPr>
+              <w:rPr>
+                <w:rFonts w:ascii="Arial" w:hAnsi="Arial" w:cs="Arial"/>
+                <w:sz w:val="12"/>
+                <w:szCs w:val="12"/>
+                <w:lang w:val="es-ES"/>
+              </w:rPr>
+            </w:pPr>
+            <w:r>
+              <w:rPr>
+                <w:rFonts w:ascii="Arial" w:hAnsi="Arial" w:cs="Arial"/>
+                <w:sz w:val="12"/>
+                <w:szCs w:val="12"/>
+                <w:lang w:val="es-ES"/>
+              </w:rPr>
               <w:t>(</w:t>
             </w:r>
             <w:r>
@@ -15527,208 +15541,7 @@
                 <w:szCs w:val="12"/>
                 <w:lang w:val="es-ES"/>
               </w:rPr>
-              <w:t>)</w:t>
-            </w:r>
-            <w:r>
-              <w:rPr>
-                <w:rFonts w:ascii="Arial" w:hAnsi="Arial" w:cs="Arial"/>
-                <w:sz w:val="12"/>
-                <w:szCs w:val="12"/>
-                <w:lang w:val="es-ES"/>
-              </w:rPr>
-              <w:t xml:space="preserve"> </w:t>
-            </w:r>
-            <w:r>
-              <w:rPr>
-                <w:rFonts w:ascii="Arial" w:hAnsi="Arial" w:cs="Arial"/>
-                <w:sz w:val="12"/>
-                <w:szCs w:val="12"/>
-                <w:lang w:val="es-ES"/>
-              </w:rPr>
-              <w:t>T ≠ R (No hay línea T)</w:t>
-            </w:r>
-          </w:p>
-          <w:p>
-            <w:pPr>
-              <w:rPr>
-                <w:rFonts w:ascii="Arial" w:hAnsi="Arial" w:cs="Arial"/>
-                <w:sz w:val="12"/>
-                <w:szCs w:val="12"/>
-                <w:lang w:val="es-ES"/>
-              </w:rPr>
-            </w:pPr>
-            <w:r>
-              <w:rPr>
-                <w:rFonts w:ascii="Arial" w:hAnsi="Arial" w:cs="Arial"/>
-                <w:sz w:val="12"/>
-                <w:szCs w:val="12"/>
-                <w:lang w:val="es-ES"/>
-              </w:rPr>
-              <w:t>(</w:t>
-            </w:r>
-            <w:r>
-              <w:rPr>
-                <w:rFonts w:ascii="Segoe UI Emoji" w:hAnsi="Segoe UI Emoji" w:cs="Segoe UI Emoji"/>
-                <w:sz w:val="12"/>
-                <w:szCs w:val="12"/>
-                <w:lang w:val="es-ES"/>
-              </w:rPr>
-              <w:t>⚪</w:t>
-            </w:r>
-            <w:r>
-              <w:rPr>
-                <w:rFonts w:ascii="Arial" w:hAnsi="Arial" w:cs="Arial"/>
-                <w:sz w:val="12"/>
-                <w:szCs w:val="12"/>
-                <w:lang w:val="es-ES"/>
-              </w:rPr>
-              <w:t>)</w:t>
-            </w:r>
-            <w:r>
-              <w:rPr>
-                <w:rFonts w:ascii="Arial" w:hAnsi="Arial" w:cs="Arial"/>
-                <w:sz w:val="12"/>
-                <w:szCs w:val="12"/>
-                <w:lang w:val="es-ES"/>
-              </w:rPr>
-              <w:t xml:space="preserve"> </w:t>
-            </w:r>
-            <w:r>
-              <w:rPr>
-                <w:rFonts w:ascii="Arial" w:hAnsi="Arial" w:cs="Arial"/>
-                <w:sz w:val="12"/>
-                <w:szCs w:val="12"/>
-                <w:lang w:val="es-ES"/>
-              </w:rPr>
-              <w:t>T &lt; R (Menor intensidad)</w:t>
-            </w:r>
-          </w:p>
-          <w:p>
-            <w:pPr>
-              <w:rPr>
-                <w:rFonts w:ascii="Arial" w:hAnsi="Arial" w:cs="Arial"/>
-                <w:sz w:val="12"/>
-                <w:szCs w:val="12"/>
-                <w:lang w:val="es-ES"/>
-              </w:rPr>
-            </w:pPr>
-            <w:r>
-              <w:rPr>
-                <w:rFonts w:ascii="Arial" w:hAnsi="Arial" w:cs="Arial"/>
-                <w:sz w:val="12"/>
-                <w:szCs w:val="12"/>
-                <w:lang w:val="es-ES"/>
-              </w:rPr>
-              <w:t>(</w:t>
-            </w:r>
-            <w:r>
-              <w:rPr>
-                <w:rFonts w:ascii="Segoe UI Emoji" w:hAnsi="Segoe UI Emoji" w:cs="Segoe UI Emoji"/>
-                <w:sz w:val="12"/>
-                <w:szCs w:val="12"/>
-                <w:lang w:val="es-ES"/>
-              </w:rPr>
-              <w:t>⚪</w:t>
-            </w:r>
-            <w:r>
-              <w:rPr>
-                <w:rFonts w:ascii="Arial" w:hAnsi="Arial" w:cs="Arial"/>
-                <w:sz w:val="12"/>
-                <w:szCs w:val="12"/>
-                <w:lang w:val="es-ES"/>
-              </w:rPr>
-              <w:t>)</w:t>
-            </w:r>
-            <w:r>
-              <w:rPr>
-                <w:rFonts w:ascii="Arial" w:hAnsi="Arial" w:cs="Arial"/>
-                <w:sz w:val="12"/>
-                <w:szCs w:val="12"/>
-                <w:lang w:val="es-ES"/>
-              </w:rPr>
-              <w:t xml:space="preserve"> </w:t>
-            </w:r>
-            <w:r>
-              <w:rPr>
-                <w:rFonts w:ascii="Arial" w:hAnsi="Arial" w:cs="Arial"/>
-                <w:sz w:val="12"/>
-                <w:szCs w:val="12"/>
-                <w:lang w:val="es-ES"/>
-              </w:rPr>
-              <w:t>T ~ R (Intensidad similar</w:t>
-            </w:r>
-            <w:r>
-              <w:rPr>
-                <w:rFonts w:ascii="Arial" w:hAnsi="Arial" w:cs="Arial"/>
-                <w:sz w:val="12"/>
-                <w:szCs w:val="12"/>
-                <w:lang w:val="es-ES"/>
-              </w:rPr>
-              <w:t xml:space="preserve"> o igual</w:t>
-            </w:r>
-            <w:r>
-              <w:rPr>
-                <w:rFonts w:ascii="Arial" w:hAnsi="Arial" w:cs="Arial"/>
-                <w:sz w:val="12"/>
-                <w:szCs w:val="12"/>
-                <w:lang w:val="es-ES"/>
-              </w:rPr>
-              <w:t>)</w:t>
-            </w:r>
-          </w:p>
-          <w:p>
-            <w:pPr>
-              <w:rPr>
-                <w:rFonts w:ascii="Arial" w:hAnsi="Arial" w:cs="Arial"/>
-                <w:sz w:val="12"/>
-                <w:szCs w:val="12"/>
-                <w:lang w:val="es-ES"/>
-              </w:rPr>
-            </w:pPr>
-            <w:r>
-              <w:rPr>
-                <w:rFonts w:ascii="Arial" w:hAnsi="Arial" w:cs="Arial"/>
-                <w:sz w:val="12"/>
-                <w:szCs w:val="12"/>
-                <w:lang w:val="es-ES"/>
-              </w:rPr>
-              <w:t>(</w:t>
-            </w:r>
-            <w:r>
-              <w:rPr>
-                <w:rFonts w:ascii="Segoe UI Emoji" w:hAnsi="Segoe UI Emoji" w:cs="Segoe UI Emoji"/>
-                <w:sz w:val="12"/>
-                <w:szCs w:val="12"/>
-                <w:lang w:val="es-ES"/>
-              </w:rPr>
-              <w:t>⚪</w:t>
-            </w:r>
-            <w:r>
-              <w:rPr>
-                <w:rFonts w:ascii="Arial" w:hAnsi="Arial" w:cs="Arial"/>
-                <w:sz w:val="12"/>
-                <w:szCs w:val="12"/>
-                <w:lang w:val="es-ES"/>
-              </w:rPr>
-              <w:t>)</w:t>
-            </w:r>
-            <w:r>
-              <w:rPr>
-                <w:rFonts w:ascii="Arial" w:hAnsi="Arial" w:cs="Arial"/>
-                <w:sz w:val="12"/>
-                <w:szCs w:val="12"/>
-                <w:lang w:val="es-ES"/>
-              </w:rPr>
-              <w:t xml:space="preserve"> </w:t>
-            </w:r>
-            <w:r>
-              <w:rPr>
-                <w:rFonts w:ascii="Arial" w:hAnsi="Arial" w:cs="Arial"/>
-                <w:sz w:val="12"/>
-                <w:szCs w:val="12"/>
-                <w:lang w:val="es-ES"/>
-              </w:rPr>
-              <w:t>T &gt; R (Mayor intensidad)</w:t>
+              <w:t>) T &gt; R (Mayor intensidad)</w:t>
             </w:r>
           </w:p>
         </w:tc>
@@ -15777,25 +15590,7 @@
                 <w:szCs w:val="12"/>
                 <w:highlight w:val="magenta"/>
               </w:rPr>
-              <w:t>“</w:t>
-            </w:r>
-            <w:r>
-              <w:rPr>
-                <w:rFonts w:ascii="Arial" w:hAnsi="Arial" w:cs="Arial"/>
-                <w:sz w:val="12"/>
-                <w:szCs w:val="12"/>
-                <w:highlight w:val="magenta"/>
-              </w:rPr>
-              <w:t>Matriz de resultados para el MAVI-16</w:t>
-            </w:r>
-            <w:r>
-              <w:rPr>
-                <w:rFonts w:ascii="Arial" w:hAnsi="Arial" w:cs="Arial"/>
-                <w:sz w:val="12"/>
-                <w:szCs w:val="12"/>
-                <w:highlight w:val="magenta"/>
-              </w:rPr>
-              <w:t>”</w:t>
+              <w:t>“Matriz de resultados para el MAVI-16”</w:t>
             </w:r>
           </w:p>
         </w:tc>
@@ -15932,17 +15727,7 @@
                 <w:sz w:val="12"/>
                 <w:szCs w:val="12"/>
               </w:rPr>
-              <w:t>I</w:t>
-            </w:r>
-            <w:r>
-              <w:rPr>
-                <w:rFonts w:ascii="Arial" w:hAnsi="Arial" w:cs="Arial"/>
-                <w:b/>
-                <w:bCs/>
-                <w:sz w:val="12"/>
-                <w:szCs w:val="12"/>
-              </w:rPr>
-              <w:t>gual</w:t>
+              <w:t>Igual</w:t>
             </w:r>
             <w:r>
               <w:rPr>
@@ -16707,37 +16492,7 @@
                 <w:sz w:val="12"/>
                 <w:szCs w:val="12"/>
               </w:rPr>
-              <w:t>R</w:t>
-            </w:r>
-            <w:r>
-              <w:rPr>
-                <w:rFonts w:ascii="Arial" w:hAnsi="Arial" w:cs="Arial"/>
-                <w:b/>
-                <w:bCs/>
-                <w:sz w:val="12"/>
-                <w:szCs w:val="12"/>
-              </w:rPr>
-              <w:t xml:space="preserve">esultado del </w:t>
-            </w:r>
-            <w:r>
-              <w:rPr>
-                <w:rFonts w:ascii="Arial" w:hAnsi="Arial" w:cs="Arial"/>
-                <w:b/>
-                <w:bCs/>
-                <w:sz w:val="12"/>
-                <w:szCs w:val="12"/>
-              </w:rPr>
-              <w:t>s</w:t>
-            </w:r>
-            <w:r>
-              <w:rPr>
-                <w:rFonts w:ascii="Arial" w:hAnsi="Arial" w:cs="Arial"/>
-                <w:b/>
-                <w:bCs/>
-                <w:sz w:val="12"/>
-                <w:szCs w:val="12"/>
-              </w:rPr>
-              <w:t>istema</w:t>
+              <w:t>Resultado del sistema</w:t>
             </w:r>
           </w:p>
         </w:tc>
@@ -16909,63 +16664,34 @@
                 <w:sz w:val="12"/>
                 <w:szCs w:val="12"/>
               </w:rPr>
-              <w:t xml:space="preserve"> </w:t>
-            </w:r>
-            <w:r>
+              <w:t xml:space="preserve"> No hay visualización de la línea de control.</w:t>
+            </w:r>
+          </w:p>
+        </w:tc>
+        <w:tc>
+          <w:tcPr>
+            <w:tcW w:w="792" w:type="dxa"/>
+            <w:vAlign w:val="center"/>
+          </w:tcPr>
+          <w:p>
+            <w:pPr>
+              <w:jc w:val="center"/>
               <w:rPr>
                 <w:rFonts w:ascii="Arial" w:hAnsi="Arial" w:cs="Arial"/>
                 <w:color w:val="EE0000"/>
                 <w:sz w:val="12"/>
                 <w:szCs w:val="12"/>
               </w:rPr>
-              <w:t>No hay visualización de la línea de control.</w:t>
-            </w:r>
-          </w:p>
-        </w:tc>
-        <w:tc>
-          <w:tcPr>
-            <w:tcW w:w="792" w:type="dxa"/>
-            <w:vAlign w:val="center"/>
-          </w:tcPr>
-          <w:p>
-            <w:pPr>
-              <w:jc w:val="center"/>
+            </w:pPr>
+            <w:r>
               <w:rPr>
                 <w:rFonts w:ascii="Arial" w:hAnsi="Arial" w:cs="Arial"/>
                 <w:color w:val="EE0000"/>
                 <w:sz w:val="12"/>
                 <w:szCs w:val="12"/>
-              </w:rPr>
-            </w:pPr>
-            <w:r>
-              <w:rPr>
-                <w:rFonts w:ascii="Arial" w:hAnsi="Arial" w:cs="Arial"/>
-                <w:color w:val="EE0000"/>
-                <w:sz w:val="12"/>
-                <w:szCs w:val="12"/>
                 <w:highlight w:val="yellow"/>
               </w:rPr>
-              <w:t xml:space="preserve">No </w:t>
-            </w:r>
-            <w:r>
-              <w:rPr>
-                <w:rFonts w:ascii="Arial" w:hAnsi="Arial" w:cs="Arial"/>
-                <w:color w:val="EE0000"/>
-                <w:sz w:val="12"/>
-                <w:szCs w:val="12"/>
-                <w:highlight w:val="yellow"/>
-              </w:rPr>
-              <w:t>c</w:t>
-            </w:r>
-            <w:r>
-              <w:rPr>
-                <w:rFonts w:ascii="Arial" w:hAnsi="Arial" w:cs="Arial"/>
-                <w:color w:val="EE0000"/>
-                <w:sz w:val="12"/>
-                <w:szCs w:val="12"/>
-                <w:highlight w:val="yellow"/>
-              </w:rPr>
-              <w:t>umple</w:t>
+              <w:t>No cumple</w:t>
             </w:r>
           </w:p>
         </w:tc>
@@ -17096,25 +16822,7 @@
                 <w:szCs w:val="12"/>
                 <w:highlight w:val="green"/>
               </w:rPr>
-              <w:t xml:space="preserve">Sí, </w:t>
-            </w:r>
-            <w:r>
-              <w:rPr>
-                <w:rFonts w:ascii="Arial" w:hAnsi="Arial" w:cs="Arial"/>
-                <w:sz w:val="12"/>
-                <w:szCs w:val="12"/>
-                <w:highlight w:val="green"/>
-              </w:rPr>
-              <w:t>v</w:t>
-            </w:r>
-            <w:r>
-              <w:rPr>
-                <w:rFonts w:ascii="Arial" w:hAnsi="Arial" w:cs="Arial"/>
-                <w:sz w:val="12"/>
-                <w:szCs w:val="12"/>
-                <w:highlight w:val="green"/>
-              </w:rPr>
-              <w:t>isible</w:t>
+              <w:t>Sí, visible</w:t>
             </w:r>
           </w:p>
         </w:tc>
@@ -19650,7 +19358,7 @@
 </file>
 
 <file path=word/numbering.xml><?xml version="1.0" encoding="utf-8"?>
-<w:numbering xmlns:wpc="http://schemas.microsoft.com/office/word/2010/wordprocessingCanvas" xmlns:cx="http://schemas.microsoft.com/office/drawing/2014/chartex" xmlns:cx1="http://schemas.microsoft.com/office/drawing/2015/9/8/chartex" xmlns:cx2="http://schemas.microsoft.com/office/drawing/2015/10/21/chartex" xmlns:cx3="http://schemas.microsoft.com/office/drawing/2016/5/9/chartex" xmlns:cx4="http://schemas.microsoft.com/office/drawing/2016/5/10/chartex" xmlns:cx5="http://schemas.microsoft.com/office/drawing/2016/5/11/chartex" xmlns:cx6="http://schemas.microsoft.com/office/drawing/2016/5/12/chartex" xmlns:cx7="http://schemas.microsoft.com/office/drawing/2016/5/13/chartex" xmlns:cx8="http://schemas.microsoft.com/office/drawing/2016/5/14/chartex" xmlns:mc="http://schemas.openxmlformats.org/markup-compatibility/2006" xmlns:aink="http://schemas.microsoft.com/office/drawing/2016/ink" xmlns:am3d="http://schemas.microsoft.com/office/drawing/2017/model3d" xmlns:o="urn:schemas-microsoft-com:office:office" xmlns:oel="http://schemas.microsoft.com/office/2019/extlst" xmlns:r="http://schemas.openxmlformats.org/officeDocument/2006/relationships" xmlns:m="http://schemas.openxmlformats.org/officeDocument/2006/math" xmlns:v="urn:schemas-microsoft-com:vml" xmlns:wp14="http://schemas.microsoft.com/office/word/2010/wordprocessingDrawing" xmlns:wp="http://schemas.openxmlformats.org/drawingml/2006/wordprocessingDrawing" xmlns:w10="urn:schemas-microsoft-com:office:word" xmlns:w="http://schemas.openxmlformats.org/wordprocessingml/2006/main" xmlns:w14="http://schemas.microsoft.com/office/word/2010/wordml" xmlns:w15="http://schemas.microsoft.com/office/word/2012/wordml" xmlns:w16cex="http://schemas.microsoft.com/office/word/2018/wordml/cex" xmlns:w16cid="http://schemas.microsoft.com/office/word/2016/wordml/cid" xmlns:w16="http://schemas.microsoft.com/office/word/2018/wordml" xmlns:w16du="http://schemas.microsoft.com/office/word/2023/wordml/word16du" xmlns:w16sdtdh="http://schemas.microsoft.com/office/word/2020/wordml/sdtdatahash" xmlns:w16sdtfl="http://schemas.microsoft.com/office/word/2024/wordml/sdtformatlock" xmlns:w16se="http://schemas.microsoft.com/office/word/2015/wordml/symex" xmlns:wpg="http://schemas.microsoft.com/office/word/2010/wordprocessingGroup" xmlns:wpi="http://schemas.microsoft.com/office/word/2010/wordprocessingInk" xmlns:wne="http://schemas.microsoft.com/office/word/2006/wordml" xmlns:wps="http://schemas.microsoft.com/office/word/2010/wordprocessingShape" mc:Ignorable="w14 w15 w16se w16cid w16 w16cex w16sdtdh w16sdtfl w16du wp14">
+<w:numbering xmlns:wpc="http://schemas.microsoft.com/office/word/2010/wordprocessingCanvas" xmlns:cx="http://schemas.microsoft.com/office/drawing/2014/chartex" xmlns:cx1="http://schemas.microsoft.com/office/drawing/2015/9/8/chartex" xmlns:cx2="http://schemas.microsoft.com/office/drawing/2015/10/21/chartex" xmlns:cx3="http://schemas.microsoft.com/office/drawing/2016/5/9/chartex" xmlns:cx4="http://schemas.microsoft.com/office/drawing/2016/5/10/chartex" xmlns:cx5="http://schemas.microsoft.com/office/drawing/2016/5/11/chartex" xmlns:cx6="http://schemas.microsoft.com/office/drawing/2016/5/12/chartex" xmlns:cx7="http://schemas.microsoft.com/office/drawing/2016/5/13/chartex" xmlns:cx8="http://schemas.microsoft.com/office/drawing/2016/5/14/chartex" xmlns:mc="http://schemas.openxmlformats.org/markup-compatibility/2006" xmlns:aink="http://schemas.microsoft.com/office/drawing/2016/ink" xmlns:am3d="http://schemas.microsoft.com/office/drawing/2017/model3d" xmlns:o="urn:schemas-microsoft-com:office:office" xmlns:r="http://schemas.openxmlformats.org/officeDocument/2006/relationships" xmlns:m="http://schemas.openxmlformats.org/officeDocument/2006/math" xmlns:v="urn:schemas-microsoft-com:vml" xmlns:wp14="http://schemas.microsoft.com/office/word/2010/wordprocessingDrawing" xmlns:wp="http://schemas.openxmlformats.org/drawingml/2006/wordprocessingDrawing" xmlns:w10="urn:schemas-microsoft-com:office:word" xmlns:w="http://schemas.openxmlformats.org/wordprocessingml/2006/main" xmlns:w14="http://schemas.microsoft.com/office/word/2010/wordml" xmlns:w15="http://schemas.microsoft.com/office/word/2012/wordml" xmlns:w16cex="http://schemas.microsoft.com/office/word/2018/wordml/cex" xmlns:w16cid="http://schemas.microsoft.com/office/word/2016/wordml/cid" xmlns:w16="http://schemas.microsoft.com/office/word/2018/wordml" xmlns:w16sdtdh="http://schemas.microsoft.com/office/word/2020/wordml/sdtdatahash" xmlns:w16se="http://schemas.microsoft.com/office/word/2015/wordml/symex" xmlns:wpg="http://schemas.microsoft.com/office/word/2010/wordprocessingGroup" xmlns:wpi="http://schemas.microsoft.com/office/word/2010/wordprocessingInk" xmlns:wne="http://schemas.microsoft.com/office/word/2006/wordml" xmlns:wps="http://schemas.microsoft.com/office/word/2010/wordprocessingShape" mc:Ignorable="w14 w15 w16se w16cid w16 w16cex w16sdtdh wp14">
   <w:abstractNum w:abstractNumId="0" w15:restartNumberingAfterBreak="0">
     <w:nsid w:val="2A3C74C8"/>
     <w:multiLevelType w:val="hybridMultilevel"/>
@@ -20165,26 +19873,26 @@
       </w:rPr>
     </w:lvl>
   </w:abstractNum>
-  <w:num w:numId="1" w16cid:durableId="1118060448">
+  <w:num w:numId="1">
     <w:abstractNumId w:val="0"/>
   </w:num>
-  <w:num w:numId="2" w16cid:durableId="1164666377">
+  <w:num w:numId="2">
     <w:abstractNumId w:val="1"/>
   </w:num>
-  <w:num w:numId="3" w16cid:durableId="1878662558">
+  <w:num w:numId="3">
     <w:abstractNumId w:val="4"/>
   </w:num>
-  <w:num w:numId="4" w16cid:durableId="208035944">
+  <w:num w:numId="4">
     <w:abstractNumId w:val="2"/>
   </w:num>
-  <w:num w:numId="5" w16cid:durableId="249243688">
+  <w:num w:numId="5">
     <w:abstractNumId w:val="3"/>
   </w:num>
 </w:numbering>
 </file>
 
 <file path=word/styles.xml><?xml version="1.0" encoding="utf-8"?>
-<w:styles xmlns:mc="http://schemas.openxmlformats.org/markup-compatibility/2006" xmlns:r="http://schemas.openxmlformats.org/officeDocument/2006/relationships" xmlns:w="http://schemas.openxmlformats.org/wordprocessingml/2006/main" xmlns:w14="http://schemas.microsoft.com/office/word/2010/wordml" xmlns:w15="http://schemas.microsoft.com/office/word/2012/wordml" xmlns:w16cex="http://schemas.microsoft.com/office/word/2018/wordml/cex" xmlns:w16cid="http://schemas.microsoft.com/office/word/2016/wordml/cid" xmlns:w16="http://schemas.microsoft.com/office/word/2018/wordml" xmlns:w16du="http://schemas.microsoft.com/office/word/2023/wordml/word16du" xmlns:w16sdtdh="http://schemas.microsoft.com/office/word/2020/wordml/sdtdatahash" xmlns:w16sdtfl="http://schemas.microsoft.com/office/word/2024/wordml/sdtformatlock" xmlns:w16se="http://schemas.microsoft.com/office/word/2015/wordml/symex" mc:Ignorable="w14 w15 w16se w16cid w16 w16cex w16sdtdh w16sdtfl w16du">
+<w:styles xmlns:mc="http://schemas.openxmlformats.org/markup-compatibility/2006" xmlns:r="http://schemas.openxmlformats.org/officeDocument/2006/relationships" xmlns:w="http://schemas.openxmlformats.org/wordprocessingml/2006/main" xmlns:w14="http://schemas.microsoft.com/office/word/2010/wordml" xmlns:w15="http://schemas.microsoft.com/office/word/2012/wordml" xmlns:w16cex="http://schemas.microsoft.com/office/word/2018/wordml/cex" xmlns:w16cid="http://schemas.microsoft.com/office/word/2016/wordml/cid" xmlns:w16="http://schemas.microsoft.com/office/word/2018/wordml" xmlns:w16sdtdh="http://schemas.microsoft.com/office/word/2020/wordml/sdtdatahash" xmlns:w16se="http://schemas.microsoft.com/office/word/2015/wordml/symex" mc:Ignorable="w14 w15 w16se w16cid w16 w16cex w16sdtdh">
   <w:docDefaults>
     <w:rPrDefault>
       <w:rPr>
@@ -20787,6 +20495,7 @@
   <w:style w:type="character" w:default="1" w:styleId="Fuentedeprrafopredeter">
     <w:name w:val="Default Paragraph Font"/>
     <w:uiPriority w:val="1"/>
+    <w:semiHidden/>
     <w:unhideWhenUsed/>
   </w:style>
   <w:style w:type="table" w:default="1" w:styleId="Tablanormal">

</xml_diff>